<commit_message>
docs: milestone 1 results
Co-Authored-By: Claude Sonnet 5.5 <noreply@anthropic.com>
Claude-Session: https://claude.ai/code/session_01KxscWn9fSBZzY3BEJFGfy4
</commit_message>
<xml_diff>
--- a/docs/specs/phase-1-foundation.docx
+++ b/docs/specs/phase-1-foundation.docx
@@ -2181,7 +2181,19 @@
         <w:t xml:space="preserve">docs/tech-stack/2026-10-04-tech-stack.md</w:t>
       </w:r>
       <w:r>
-        <w:t xml:space="preserve">), which gives the reason for each choice. Its rule: the most stable, widely used option for each job, a major version about a year old or more, and no release younger than 30 days. The versions below are copied from it. The first work package (section 18, package 0) confirms they work together before other work starts.</w:t>
+        <w:t xml:space="preserve">), which gives the reason for each choice. Its rule: the most stable, widely used option for each job, a major version about a year old or more, and no release younger than 30 days. The versions below are copied from it. The first work package (section 18, package 0) confirms they work together before other work starts. Confirmed on Node 24.20.0 in milestone 1; see </w:t>
+      </w:r>
+      <w:r>
+        <w:rPr>
+          <w:rFonts w:ascii="Consolas" w:cs="Consolas" w:eastAsia="Consolas" w:hAnsi="Consolas"/>
+          <w:sz w:val="20"/>
+          <w:szCs w:val="20"/>
+          <w:shd w:fill="F0F0F0" w:val="clear"/>
+        </w:rPr>
+        <w:t xml:space="preserve">docs/progress.md</w:t>
+      </w:r>
+      <w:r>
+        <w:t xml:space="preserve">.</w:t>
       </w:r>
     </w:p>
     <w:tbl>

</xml_diff>